<commit_message>
Minor fixes + editted word doc
</commit_message>
<xml_diff>
--- a/Web Frameworks.docx
+++ b/Web Frameworks.docx
@@ -145,11 +145,9 @@
       </w:r>
     </w:p>
     <w:p>
-      <w:proofErr w:type="gramStart"/>
       <w:r>
         <w:t>package.json</w:t>
       </w:r>
-      <w:proofErr w:type="gramEnd"/>
     </w:p>
     <w:p>
       <w:r>
@@ -412,15 +410,7 @@
     </w:p>
     <w:p>
       <w:r>
-        <w:t>It can register a user into the system, by taking data from form (</w:t>
-      </w:r>
-      <w:proofErr w:type="gramStart"/>
-      <w:r>
-        <w:t>req.body</w:t>
-      </w:r>
-      <w:proofErr w:type="gramEnd"/>
-      <w:r>
-        <w:t xml:space="preserve">) then using function from the model, which goes to database and check </w:t>
+        <w:t xml:space="preserve">It can register a user into the system, by taking data from form (req.body) then using function from the model, which goes to database and check </w:t>
       </w:r>
       <w:r>
         <w:t>whether</w:t>
@@ -565,15 +555,7 @@
       </w:r>
       <w:proofErr w:type="spellEnd"/>
       <w:r>
-        <w:t xml:space="preserve">, which we will be able to use from now on. Also, I should mention about </w:t>
-      </w:r>
-      <w:proofErr w:type="gramStart"/>
-      <w:r>
-        <w:t>next(</w:t>
-      </w:r>
-      <w:proofErr w:type="gramEnd"/>
-      <w:r>
-        <w:t>). Because I will be using this function in router, it is very important to show our program that it can go to the following page, otherwise it will be waiting for eternity.</w:t>
+        <w:t>, which we will be able to use from now on. Also, I should mention about next(). Because I will be using this function in router, it is very important to show our program that it can go to the following page, otherwise it will be waiting for eternity.</w:t>
       </w:r>
     </w:p>
     <w:p>
@@ -631,14 +613,7 @@
       </w:r>
       <w:r>
         <w:br/>
-      </w:r>
-      <w:proofErr w:type="gramStart"/>
-      <w:r>
-        <w:t>getall(</w:t>
-      </w:r>
-      <w:proofErr w:type="gramEnd"/>
-      <w:r>
-        <w:t>) To render all posts on the web page.</w:t>
+        <w:t>getall() To render all posts on the web page.</w:t>
       </w:r>
     </w:p>
     <w:p>
@@ -684,14 +659,9 @@
       </w:r>
     </w:p>
     <w:p>
-      <w:proofErr w:type="gramStart"/>
       <w:r>
         <w:lastRenderedPageBreak/>
-        <w:t>createPost(</w:t>
-      </w:r>
-      <w:proofErr w:type="gramEnd"/>
-      <w:r>
-        <w:t xml:space="preserve">), which firstly saves all the posts in the variable, then extracts data from the form and creates a post. </w:t>
+        <w:t xml:space="preserve">createPost(), which firstly saves all the posts in the variable, then extracts data from the form and creates a post. </w:t>
       </w:r>
     </w:p>
     <w:p>
@@ -737,13 +707,8 @@
       </w:r>
     </w:p>
     <w:p>
-      <w:proofErr w:type="gramStart"/>
-      <w:r>
-        <w:t>deletePost(</w:t>
-      </w:r>
-      <w:proofErr w:type="gramEnd"/>
-      <w:r>
-        <w:t>), which firstly check if the post exists, then if the author of post is the user, who’s trying to delete it.</w:t>
+      <w:r>
+        <w:t>deletePost(), which firstly check if the post exists, then if the author of post is the user, who’s trying to delete it.</w:t>
       </w:r>
     </w:p>
     <w:p>
@@ -812,30 +777,27 @@
       </w:r>
       <w:proofErr w:type="spellEnd"/>
       <w:r>
-        <w:t xml:space="preserve"> and postRouter.</w:t>
-      </w:r>
-      <w:r>
-        <w:t xml:space="preserve"> They just bind the functions from the controller and </w:t>
-      </w:r>
-      <w:proofErr w:type="gramStart"/>
-      <w:r>
-        <w:t>uses</w:t>
-      </w:r>
-      <w:proofErr w:type="gramEnd"/>
-      <w:r>
-        <w:t xml:space="preserve"> the middleware function I wrote to check for JWT token.</w:t>
-      </w:r>
-    </w:p>
-    <w:p>
-      <w:r>
-        <w:rPr>
-          <w:noProof/>
-        </w:rPr>
+        <w:t xml:space="preserve"> and </w:t>
+      </w:r>
+      <w:proofErr w:type="spellStart"/>
+      <w:r>
+        <w:t>postRouter</w:t>
+      </w:r>
+      <w:proofErr w:type="spellEnd"/>
+      <w:r>
+        <w:t>.</w:t>
+      </w:r>
+      <w:r>
+        <w:t xml:space="preserve"> They just bind the functions from the controller and uses the middleware function I wrote to check for JWT token.</w:t>
+      </w:r>
+    </w:p>
+    <w:p>
+      <w:r>
         <w:drawing>
-          <wp:inline distT="0" distB="0" distL="0" distR="0" wp14:anchorId="6B7591B1" wp14:editId="2ECAB157">
-            <wp:extent cx="4838700" cy="3500633"/>
-            <wp:effectExtent l="0" t="0" r="0" b="5080"/>
-            <wp:docPr id="638421660" name="Picture 1"/>
+          <wp:inline distT="0" distB="0" distL="0" distR="0" wp14:anchorId="1C700E11" wp14:editId="3776CA02">
+            <wp:extent cx="5532599" cy="2712955"/>
+            <wp:effectExtent l="0" t="0" r="0" b="0"/>
+            <wp:docPr id="1582612320" name="Picture 1" descr="A screen shot of a computer code&#10;&#10;AI-generated content may be incorrect."/>
             <wp:cNvGraphicFramePr>
               <a:graphicFrameLocks xmlns:a="http://schemas.openxmlformats.org/drawingml/2006/main" noChangeAspect="1"/>
             </wp:cNvGraphicFramePr>
@@ -843,7 +805,7 @@
               <a:graphicData uri="http://schemas.openxmlformats.org/drawingml/2006/picture">
                 <pic:pic xmlns:pic="http://schemas.openxmlformats.org/drawingml/2006/picture">
                   <pic:nvPicPr>
-                    <pic:cNvPr id="638421660" name=""/>
+                    <pic:cNvPr id="1582612320" name="Picture 1" descr="A screen shot of a computer code&#10;&#10;AI-generated content may be incorrect."/>
                     <pic:cNvPicPr/>
                   </pic:nvPicPr>
                   <pic:blipFill>
@@ -855,7 +817,7 @@
                   <pic:spPr>
                     <a:xfrm>
                       <a:off x="0" y="0"/>
-                      <a:ext cx="4846771" cy="3506472"/>
+                      <a:ext cx="5532599" cy="2712955"/>
                     </a:xfrm>
                     <a:prstGeom prst="rect">
                       <a:avLst/>
@@ -905,7 +867,7 @@
                     <pic:cNvPicPr/>
                   </pic:nvPicPr>
                   <pic:blipFill>
-                    <a:blip r:embed="rId18"/>
+                    <a:blip r:embed="rId19"/>
                     <a:stretch>
                       <a:fillRect/>
                     </a:stretch>
@@ -931,17 +893,17 @@
         <w:pStyle w:val="Heading2"/>
       </w:pPr>
       <w:r>
+        <w:t>Models</w:t>
+      </w:r>
+    </w:p>
+    <w:p>
+      <w:r>
+        <w:t>2 Models, both describing how to save data in MongoDB</w:t>
+      </w:r>
+    </w:p>
+    <w:p>
+      <w:r>
         <w:lastRenderedPageBreak/>
-        <w:t>Models</w:t>
-      </w:r>
-    </w:p>
-    <w:p>
-      <w:r>
-        <w:t>2 Models, both describing how to save data in MongoDB</w:t>
-      </w:r>
-    </w:p>
-    <w:p>
-      <w:r>
         <w:t>Post saves author, title and content.</w:t>
       </w:r>
     </w:p>
@@ -971,7 +933,7 @@
                     <pic:cNvPicPr/>
                   </pic:nvPicPr>
                   <pic:blipFill>
-                    <a:blip r:embed="rId19"/>
+                    <a:blip r:embed="rId20"/>
                     <a:stretch>
                       <a:fillRect/>
                     </a:stretch>
@@ -1013,7 +975,7 @@
                     <pic:cNvPicPr/>
                   </pic:nvPicPr>
                   <pic:blipFill>
-                    <a:blip r:embed="rId20"/>
+                    <a:blip r:embed="rId21"/>
                     <a:stretch>
                       <a:fillRect/>
                     </a:stretch>
@@ -1060,7 +1022,7 @@
                     <pic:cNvPicPr/>
                   </pic:nvPicPr>
                   <pic:blipFill>
-                    <a:blip r:embed="rId21"/>
+                    <a:blip r:embed="rId22"/>
                     <a:stretch>
                       <a:fillRect/>
                     </a:stretch>
@@ -1110,7 +1072,7 @@
                     <pic:cNvPicPr/>
                   </pic:nvPicPr>
                   <pic:blipFill>
-                    <a:blip r:embed="rId22"/>
+                    <a:blip r:embed="rId23"/>
                     <a:stretch>
                       <a:fillRect/>
                     </a:stretch>
@@ -1148,6 +1110,9 @@
     </w:p>
     <w:p>
       <w:r>
+        <w:rPr>
+          <w:noProof/>
+        </w:rPr>
         <w:drawing>
           <wp:inline distT="0" distB="0" distL="0" distR="0" wp14:anchorId="2BCB11ED" wp14:editId="625D283D">
             <wp:extent cx="5731510" cy="2482215"/>
@@ -1164,7 +1129,7 @@
                     <pic:cNvPicPr/>
                   </pic:nvPicPr>
                   <pic:blipFill>
-                    <a:blip r:embed="rId23"/>
+                    <a:blip r:embed="rId24"/>
                     <a:stretch>
                       <a:fillRect/>
                     </a:stretch>
@@ -1206,7 +1171,7 @@
       </w:r>
     </w:p>
     <w:p>
-      <w:hyperlink r:id="rId24" w:history="1">
+      <w:hyperlink r:id="rId25" w:history="1">
         <w:r>
           <w:rPr>
             <w:rStyle w:val="Hyperlink"/>
@@ -1217,6 +1182,9 @@
     </w:p>
     <w:p>
       <w:r>
+        <w:rPr>
+          <w:noProof/>
+        </w:rPr>
         <w:drawing>
           <wp:inline distT="0" distB="0" distL="0" distR="0" wp14:anchorId="6B6C6826" wp14:editId="37D1EA64">
             <wp:extent cx="5731510" cy="2898140"/>
@@ -1233,7 +1201,7 @@
                     <pic:cNvPicPr/>
                   </pic:nvPicPr>
                   <pic:blipFill>
-                    <a:blip r:embed="rId25"/>
+                    <a:blip r:embed="rId26"/>
                     <a:stretch>
                       <a:fillRect/>
                     </a:stretch>
@@ -1262,6 +1230,9 @@
     </w:p>
     <w:p>
       <w:r>
+        <w:rPr>
+          <w:noProof/>
+        </w:rPr>
         <w:lastRenderedPageBreak/>
         <w:drawing>
           <wp:inline distT="0" distB="0" distL="0" distR="0" wp14:anchorId="6D4F2C4D" wp14:editId="7D3D5497">
@@ -1279,7 +1250,7 @@
                     <pic:cNvPicPr/>
                   </pic:nvPicPr>
                   <pic:blipFill>
-                    <a:blip r:embed="rId26"/>
+                    <a:blip r:embed="rId27"/>
                     <a:stretch>
                       <a:fillRect/>
                     </a:stretch>

</xml_diff>